<commit_message>
Tài liệu kèm theo chọn theo từng hồ sơ (ô tick + danh mục sửa ở Cài đặt); đưa Công ty & Hợp đồng vào Cài đặt
Co-Authored-By: Claude Sonnet 5.5 <noreply@anthropic.com>
Claude-Session: https://claude.ai/code/session_01E35Rv4dC73JM56xVohPzXJ
</commit_message>
<xml_diff>
--- a/HUONG_DAN_THIET_LAP.docx
+++ b/HUONG_DAN_THIET_LAP.docx
@@ -1310,6 +1310,34 @@
         <w:t xml:space="preserve">Bước 5. </w:t>
       </w:r>
       <w:r>
+        <w:t>Tài liệu kèm theo mỗi đề nghị: ở bước "Giấy nhận nợ" của hồ sơ, tick các tài liệu thực tế có trong hồ sơ (Hóa đơn GTGT, Bảng lương, Hợp đồng kinh tế…) và gõ thêm nếu cần; chuỗi này in ở dòng "Tài liệu liên quan:" của văn bản đề nghị. Danh mục ô tick sửa ở Cài đặt → Cấu hình hệ thống → Danh mục tài liệu kèm theo.</w:t>
+      </w:r>
+    </w:p>
+    <w:p>
+      <w:pPr>
+        <w:ind w:left="510" w:hanging="510"/>
+      </w:pPr>
+      <w:r>
+        <w:rPr>
+          <w:b/>
+        </w:rPr>
+        <w:t xml:space="preserve">Bước 6. </w:t>
+      </w:r>
+      <w:r>
+        <w:t>Công ty &amp; Hợp đồng vay nằm trong Cài đặt (nút "Công ty &amp; Hợp đồng vay"), không còn ở menu bên trái.</w:t>
+      </w:r>
+    </w:p>
+    <w:p>
+      <w:pPr>
+        <w:ind w:left="510" w:hanging="510"/>
+      </w:pPr>
+      <w:r>
+        <w:rPr>
+          <w:b/>
+        </w:rPr>
+        <w:t xml:space="preserve">Bước 7. </w:t>
+      </w:r>
+      <w:r>
         <w:t>Phần mềm chặn phát hành khi thiếu dữ liệu bắt buộc và nêu rõ {{KHOÁ}} cùng nơi cần bổ sung (ví dụ DM_CongTy.NguoiDaiDien).</w:t>
       </w:r>
     </w:p>
@@ -1321,7 +1349,7 @@
         <w:rPr>
           <w:b/>
         </w:rPr>
-        <w:t xml:space="preserve">Bước 6. </w:t>
+        <w:t xml:space="preserve">Bước 8. </w:t>
       </w:r>
       <w:r>
         <w:t>Tệp lưu trong Drive: HoSoVay / &lt;Mã hồ sơ&gt; / DOCX | XLSX | PDF; lịch sử ghi ở tab LichSuPhatHanhTaiLieu (kể cả lần lỗi).</w:t>

</xml_diff>

<commit_message>
Loại hồ sơ giải ngân: tự đặt loại và chọn bộ chứng từ (hồ sơ không dùng HĐTD vẫn UNC/Bảng kê)
- Cột LoaiHoSoGiaiNgan; Cài đặt: bảng Loại hồ sơ (mặc định: Giải ngân theo HĐTD / Không dùng HĐTD)
- Tạo trọn bộ, danh sách chứng từ và phát hành riêng lẻ theo loại hồ sơ; hồ sơ cũ dùng loại đầu tiên

Co-Authored-By: Claude Sonnet 5.5 <noreply@anthropic.com>
Claude-Session: https://claude.ai/code/session_01E35Rv4dC73JM56xVohPzXJ
</commit_message>
<xml_diff>
--- a/HUONG_DAN_THIET_LAP.docx
+++ b/HUONG_DAN_THIET_LAP.docx
@@ -1324,7 +1324,7 @@
         <w:t xml:space="preserve">Bước 6. </w:t>
       </w:r>
       <w:r>
-        <w:t>Công ty &amp; Hợp đồng vay nằm trong Cài đặt (nút "Công ty &amp; Hợp đồng vay"), không còn ở menu bên trái.</w:t>
+        <w:t>Hồ sơ không dùng HĐTD: chọn "Loại hồ sơ giải ngân" ở bước "Giấy nhận nợ". Tự đặt loại và chọn bộ chứng từ (Văn bản đề nghị HĐTD / UNC-Bảng kê / HĐ mua bán ngoại tệ) ở Cài đặt → Cấu hình hệ thống → Loại hồ sơ giải ngân. Có sẵn "Giải ngân theo HĐTD" (đủ bộ) và "Không dùng HĐTD" (vẫn UNC/Bảng kê). Hồ sơ cũ dùng loại đầu tiên.</w:t>
       </w:r>
     </w:p>
     <w:p>
@@ -1338,6 +1338,20 @@
         <w:t xml:space="preserve">Bước 7. </w:t>
       </w:r>
       <w:r>
+        <w:t>Công ty &amp; Hợp đồng vay nằm trong Cài đặt (nút "Công ty &amp; Hợp đồng vay"), không còn ở menu bên trái.</w:t>
+      </w:r>
+    </w:p>
+    <w:p>
+      <w:pPr>
+        <w:ind w:left="510" w:hanging="510"/>
+      </w:pPr>
+      <w:r>
+        <w:rPr>
+          <w:b/>
+        </w:rPr>
+        <w:t xml:space="preserve">Bước 8. </w:t>
+      </w:r>
+      <w:r>
         <w:t>Phần mềm chặn phát hành khi thiếu dữ liệu bắt buộc và nêu rõ {{KHOÁ}} cùng nơi cần bổ sung (ví dụ DM_CongTy.NguoiDaiDien).</w:t>
       </w:r>
     </w:p>
@@ -1349,7 +1363,7 @@
         <w:rPr>
           <w:b/>
         </w:rPr>
-        <w:t xml:space="preserve">Bước 8. </w:t>
+        <w:t xml:space="preserve">Bước 9. </w:t>
       </w:r>
       <w:r>
         <w:t>Tệp lưu trong Drive: HoSoVay / &lt;Mã hồ sơ&gt; / DOCX | XLSX | PDF; lịch sử ghi ở tab LichSuPhatHanhTaiLieu (kể cả lần lỗi).</w:t>

</xml_diff>

<commit_message>
Loại tài liệu tự thêm (không sửa mã) + loại hồ sơ tick theo mọi loại tài liệu
- Cài đặt: bảng Loại tài liệu (mã, tên, áp dụng loại tiền); hệ thống 3 loại + loại tự thêm lập từ mẫu
- Tạo trọn bộ / danh sách chứng từ / tạo riêng theo loại hồ sơ, kể cả loại tự thêm; chưa có mẫu → bỏ qua kèm ghi chú
- taoChungTuTuyChon; nhanChungTu_/tienToFile_/loaiCanHangMau_ thay các bảng cố định

Co-Authored-By: Claude Sonnet 5.5 <noreply@anthropic.com>
Claude-Session: https://claude.ai/code/session_01E35Rv4dC73JM56xVohPzXJ
</commit_message>
<xml_diff>
--- a/HUONG_DAN_THIET_LAP.docx
+++ b/HUONG_DAN_THIET_LAP.docx
@@ -1338,7 +1338,7 @@
         <w:t xml:space="preserve">Bước 7. </w:t>
       </w:r>
       <w:r>
-        <w:t>Công ty &amp; Hợp đồng vay nằm trong Cài đặt (nút "Công ty &amp; Hợp đồng vay"), không còn ở menu bên trái.</w:t>
+        <w:t>Thêm loại tài liệu mới (Giấy nhận nợ, Tờ trình…): Cài đặt → Cấu hình hệ thống → Loại tài liệu → Thêm (mã HOA, tên, áp dụng cho loại tiền) → Lưu; tải mẫu cho loại đó ở Quản lý mẫu văn bản; tick loại tài liệu cho từng Loại hồ sơ giải ngân. Hồ sơ chọn loại đó thì Tạo trọn bộ lập luôn tài liệu mới từ mẫu. Loại tự thêm chỉ lập từ mẫu và chỉ dùng placeholder có trong danh mục.</w:t>
       </w:r>
     </w:p>
     <w:p>
@@ -1352,6 +1352,20 @@
         <w:t xml:space="preserve">Bước 8. </w:t>
       </w:r>
       <w:r>
+        <w:t>Công ty &amp; Hợp đồng vay nằm trong Cài đặt (nút "Công ty &amp; Hợp đồng vay"), không còn ở menu bên trái.</w:t>
+      </w:r>
+    </w:p>
+    <w:p>
+      <w:pPr>
+        <w:ind w:left="510" w:hanging="510"/>
+      </w:pPr>
+      <w:r>
+        <w:rPr>
+          <w:b/>
+        </w:rPr>
+        <w:t xml:space="preserve">Bước 9. </w:t>
+      </w:r>
+      <w:r>
         <w:t>Phần mềm chặn phát hành khi thiếu dữ liệu bắt buộc và nêu rõ {{KHOÁ}} cùng nơi cần bổ sung (ví dụ DM_CongTy.NguoiDaiDien).</w:t>
       </w:r>
     </w:p>
@@ -1363,7 +1377,7 @@
         <w:rPr>
           <w:b/>
         </w:rPr>
-        <w:t xml:space="preserve">Bước 9. </w:t>
+        <w:t xml:space="preserve">Bước 10. </w:t>
       </w:r>
       <w:r>
         <w:t>Tệp lưu trong Drive: HoSoVay / &lt;Mã hồ sơ&gt; / DOCX | XLSX | PDF; lịch sử ghi ở tab LichSuPhatHanhTaiLieu (kể cả lần lỗi).</w:t>

</xml_diff>

<commit_message>
Xoá mẫu văn bản chưa từng dùng phát hành (file vào thùng rác Drive, ghi nhật ký)
Co-Authored-By: Claude Sonnet 5.5 <noreply@anthropic.com>
Claude-Session: https://claude.ai/code/session_01E35Rv4dC73JM56xVohPzXJ
</commit_message>
<xml_diff>
--- a/HUONG_DAN_THIET_LAP.docx
+++ b/HUONG_DAN_THIET_LAP.docx
@@ -1562,6 +1562,28 @@
           </w:p>
         </w:tc>
       </w:tr>
+      <w:tr>
+        <w:tc>
+          <w:tcPr>
+            <w:tcW w:type="dxa" w:w="2551"/>
+          </w:tcPr>
+          <w:p>
+            <w:r>
+              <w:t>Xoá</w:t>
+            </w:r>
+          </w:p>
+        </w:tc>
+        <w:tc>
+          <w:tcPr>
+            <w:tcW w:type="dxa" w:w="6803"/>
+          </w:tcPr>
+          <w:p>
+            <w:r>
+              <w:t>Chỉ xoá được phiên bản CHƯA từng dùng phát hành tài liệu (file mẫu vào thùng rác Drive, khôi phục được khoảng 30 ngày). Mẫu đã dùng thì chỉ Ngừng được</w:t>
+            </w:r>
+          </w:p>
+        </w:tc>
+      </w:tr>
     </w:tbl>
     <w:p/>
     <w:p>

</xml_diff>

<commit_message>
Trình tạo mẫu: chọn trường bằng danh sách tiếng Việt (tự gán), nhận vùng chọn cả khi chạm/bàn phím, thêm mẫu ngay trong trình tạo
Co-Authored-By: Claude Sonnet 5.5 <noreply@anthropic.com>
Claude-Session: https://claude.ai/code/session_01E35Rv4dC73JM56xVohPzXJ
</commit_message>
<xml_diff>
--- a/HUONG_DAN_THIET_LAP.docx
+++ b/HUONG_DAN_THIET_LAP.docx
@@ -847,7 +847,7 @@
         <w:t xml:space="preserve">Bước 4. </w:t>
       </w:r>
       <w:r>
-        <w:t>Chỗ chưa có gợi ý: dùng chuột bôi chọn đúng đoạn chữ cần thay → gõ/chọn "Trường dữ liệu" (ví dụ CONG_TY.TEN) → bấm "Gán vùng đang chọn". Chỉ đặt con trỏ (không bôi chọn) rồi gán = CHÈN trường tại vị trí đó (ví dụ sau nhãn "Tài liệu liên quan: ").</w:t>
+        <w:t>Chỗ chưa có gợi ý: dùng chuột (hoặc chạm kéo trên điện thoại) bôi chọn đúng đoạn chữ cần thay → mở ô "Trường dữ liệu" (danh sách thả xuống, có tên tiếng Việt, chia nhóm) → chọn trường là TỰ GÁN vào chữ đang bôi chọn. Chỉ đặt con trỏ (không bôi chọn) rồi chọn trường = CHÈN tại vị trí đó (ví dụ sau nhãn "Tài liệu liên quan: "). Gán nhầm thì bấm ✕ cạnh vùng đã gán.</w:t>
       </w:r>
     </w:p>
     <w:p>
@@ -861,7 +861,7 @@
         <w:t xml:space="preserve">Bước 5. </w:t>
       </w:r>
       <w:r>
-        <w:t>Bảng thụ hưởng: giữ 1 hàng dữ liệu làm hàng mẫu (hàng này được nhân bản theo số người). Tích "xoá cả hàng bảng này" ở các hàng ví dụ còn lại. KHÔNG xoá hàng tiêu đề và hàng tổng cộng. Ở hàng tổng, gán ô tổng tiền bằng BANG_KE.TONG_TIEN hoặc BANG_KE.TONG_TIEN_QUY_DOI.</w:t>
+        <w:t>Bảng thụ hưởng: giữ 1 hàng dữ liệu làm hàng mẫu (hàng này được nhân bản theo số người). Tích "xoá cả hàng bảng này" ở các hàng ví dụ còn lại. KHÔNG xoá hàng tiêu đề và hàng tổng cộng. Ở hàng tổng, chọn trường "Tổng cộng số tiền" hoặc "Tổng cộng quy đổi VND".</w:t>
       </w:r>
     </w:p>
     <w:p>
@@ -875,7 +875,7 @@
         <w:t xml:space="preserve">Bước 6. </w:t>
       </w:r>
       <w:r>
-        <w:t>Bấm "Tạo mẫu &amp; kiểm tra". Có thể tải file mẫu về mở bằng Word để xem. Nếu hợp lệ bấm "Dùng làm file mẫu ở khung Tải mẫu văn bản".</w:t>
+        <w:t>Bấm "Tạo mẫu &amp; kiểm tra". Có thể tải file mẫu về mở bằng Word để xem.</w:t>
       </w:r>
     </w:p>
     <w:p>
@@ -889,7 +889,15 @@
         <w:t xml:space="preserve">Bước 7. </w:t>
       </w:r>
       <w:r>
-        <w:t>Kéo lên khung "Tải mẫu văn bản lên": điền Mã mẫu, Tên mẫu, Ngân hàng, Loại tiền, Loại chứng từ, Điều kiện số người → "Tải lên &amp; kiểm tra mẫu". Xong.</w:t>
+        <w:t>Ngay dưới kết quả có khung "Thêm mẫu này vào hệ thống": điền Mã mẫu, Tên mẫu, Ngân hàng, Loại tiền, Loại chứng từ, Điều kiện số người (trống = tự nhận) rồi bấm "➕ Thêm mẫu này". Mẫu có ngay trong danh sách bên dưới; bấm "Xem trước" để kiểm tra.</w:t>
+      </w:r>
+    </w:p>
+    <w:p>
+      <w:r>
+        <w:rPr>
+          <w:b w:val="0"/>
+        </w:rPr>
+        <w:t>In ra đúng như mẫu: hệ thống chỉ ĐIỀN dữ liệu vào bản sao của mẫu; font, cỡ chữ, màu, căn lề, viền bảng, khổ giấy, logo, header/footer giữ như file bạn tải lên. Sửa mẫu trong Word thế nào thì bản DOCX in ra thế đó (tải lại thành phiên bản mới). Bản PDF do Google chuyển đổi nên có thể lệch nhẹ font/khoảng cách so với Word.</w:t>
       </w:r>
     </w:p>
     <w:p>

</xml_diff>